<commit_message>
Clarify JEPA-style pretraining description
</commit_message>
<xml_diff>
--- a/paper/jepa_mlff_manuscript.docx
+++ b/paper/jepa_mlff_manuscript.docx
@@ -4,8 +4,7 @@
   <w:body>
     <w:p>
       <w:pPr>
-        <w:spacing w:before="0" w:after="0" w:line="240" w:lineRule="auto"/>
-        <w:jc w:val="center"/>
+        <w:spacing w:before="0" w:after="0"/>
       </w:pPr>
       <w:r>
         <w:drawing>
@@ -19,7 +18,7 @@
               <a:graphicData uri="http://schemas.openxmlformats.org/drawingml/2006/picture">
                 <pic:pic>
                   <pic:nvPicPr>
-                    <pic:cNvPr id="0" name="page-1.png"/>
+                    <pic:cNvPr id="0" name="page_01.png"/>
                     <pic:cNvPicPr/>
                   </pic:nvPicPr>
                   <pic:blipFill>
@@ -44,8 +43,17 @@
     </w:p>
     <w:p>
       <w:pPr>
-        <w:spacing w:before="0" w:after="0" w:line="240" w:lineRule="auto"/>
-        <w:jc w:val="center"/>
+        <w:sectPr>
+          <w:pgSz w:w="12240" w:h="15840"/>
+          <w:pgMar w:top="504" w:right="504" w:bottom="504" w:left="504" w:header="720" w:footer="720" w:gutter="0"/>
+          <w:cols w:space="720"/>
+          <w:docGrid w:linePitch="360"/>
+        </w:sectPr>
+      </w:pPr>
+    </w:p>
+    <w:p>
+      <w:pPr>
+        <w:spacing w:before="0" w:after="0"/>
       </w:pPr>
       <w:r>
         <w:drawing>
@@ -59,7 +67,7 @@
               <a:graphicData uri="http://schemas.openxmlformats.org/drawingml/2006/picture">
                 <pic:pic>
                   <pic:nvPicPr>
-                    <pic:cNvPr id="0" name="page-2.png"/>
+                    <pic:cNvPr id="0" name="page_02.png"/>
                     <pic:cNvPicPr/>
                   </pic:nvPicPr>
                   <pic:blipFill>
@@ -84,8 +92,17 @@
     </w:p>
     <w:p>
       <w:pPr>
-        <w:spacing w:before="0" w:after="0" w:line="240" w:lineRule="auto"/>
-        <w:jc w:val="center"/>
+        <w:sectPr>
+          <w:pgSz w:w="12240" w:h="15840"/>
+          <w:pgMar w:top="504" w:right="504" w:bottom="504" w:left="504" w:header="720" w:footer="720" w:gutter="0"/>
+          <w:cols w:space="720"/>
+          <w:docGrid w:linePitch="360"/>
+        </w:sectPr>
+      </w:pPr>
+    </w:p>
+    <w:p>
+      <w:pPr>
+        <w:spacing w:before="0" w:after="0"/>
       </w:pPr>
       <w:r>
         <w:drawing>
@@ -99,7 +116,7 @@
               <a:graphicData uri="http://schemas.openxmlformats.org/drawingml/2006/picture">
                 <pic:pic>
                   <pic:nvPicPr>
-                    <pic:cNvPr id="0" name="page-3.png"/>
+                    <pic:cNvPr id="0" name="page_03.png"/>
                     <pic:cNvPicPr/>
                   </pic:nvPicPr>
                   <pic:blipFill>
@@ -124,8 +141,17 @@
     </w:p>
     <w:p>
       <w:pPr>
-        <w:spacing w:before="0" w:after="0" w:line="240" w:lineRule="auto"/>
-        <w:jc w:val="center"/>
+        <w:sectPr>
+          <w:pgSz w:w="12240" w:h="15840"/>
+          <w:pgMar w:top="504" w:right="504" w:bottom="504" w:left="504" w:header="720" w:footer="720" w:gutter="0"/>
+          <w:cols w:space="720"/>
+          <w:docGrid w:linePitch="360"/>
+        </w:sectPr>
+      </w:pPr>
+    </w:p>
+    <w:p>
+      <w:pPr>
+        <w:spacing w:before="0" w:after="0"/>
       </w:pPr>
       <w:r>
         <w:drawing>
@@ -139,7 +165,7 @@
               <a:graphicData uri="http://schemas.openxmlformats.org/drawingml/2006/picture">
                 <pic:pic>
                   <pic:nvPicPr>
-                    <pic:cNvPr id="0" name="page-4.png"/>
+                    <pic:cNvPr id="0" name="page_04.png"/>
                     <pic:cNvPicPr/>
                   </pic:nvPicPr>
                   <pic:blipFill>
@@ -164,8 +190,17 @@
     </w:p>
     <w:p>
       <w:pPr>
-        <w:spacing w:before="0" w:after="0" w:line="240" w:lineRule="auto"/>
-        <w:jc w:val="center"/>
+        <w:sectPr>
+          <w:pgSz w:w="12240" w:h="15840"/>
+          <w:pgMar w:top="504" w:right="504" w:bottom="504" w:left="504" w:header="720" w:footer="720" w:gutter="0"/>
+          <w:cols w:space="720"/>
+          <w:docGrid w:linePitch="360"/>
+        </w:sectPr>
+      </w:pPr>
+    </w:p>
+    <w:p>
+      <w:pPr>
+        <w:spacing w:before="0" w:after="0"/>
       </w:pPr>
       <w:r>
         <w:drawing>
@@ -179,7 +214,7 @@
               <a:graphicData uri="http://schemas.openxmlformats.org/drawingml/2006/picture">
                 <pic:pic>
                   <pic:nvPicPr>
-                    <pic:cNvPr id="0" name="page-5.png"/>
+                    <pic:cNvPr id="0" name="page_05.png"/>
                     <pic:cNvPicPr/>
                   </pic:nvPicPr>
                   <pic:blipFill>
@@ -204,8 +239,17 @@
     </w:p>
     <w:p>
       <w:pPr>
-        <w:spacing w:before="0" w:after="0" w:line="240" w:lineRule="auto"/>
-        <w:jc w:val="center"/>
+        <w:sectPr>
+          <w:pgSz w:w="12240" w:h="15840"/>
+          <w:pgMar w:top="504" w:right="504" w:bottom="504" w:left="504" w:header="720" w:footer="720" w:gutter="0"/>
+          <w:cols w:space="720"/>
+          <w:docGrid w:linePitch="360"/>
+        </w:sectPr>
+      </w:pPr>
+    </w:p>
+    <w:p>
+      <w:pPr>
+        <w:spacing w:before="0" w:after="0"/>
       </w:pPr>
       <w:r>
         <w:drawing>
@@ -219,7 +263,7 @@
               <a:graphicData uri="http://schemas.openxmlformats.org/drawingml/2006/picture">
                 <pic:pic>
                   <pic:nvPicPr>
-                    <pic:cNvPr id="0" name="page-6.png"/>
+                    <pic:cNvPr id="0" name="page_06.png"/>
                     <pic:cNvPicPr/>
                   </pic:nvPicPr>
                   <pic:blipFill>
@@ -244,8 +288,17 @@
     </w:p>
     <w:p>
       <w:pPr>
-        <w:spacing w:before="0" w:after="0" w:line="240" w:lineRule="auto"/>
-        <w:jc w:val="center"/>
+        <w:sectPr>
+          <w:pgSz w:w="12240" w:h="15840"/>
+          <w:pgMar w:top="504" w:right="504" w:bottom="504" w:left="504" w:header="720" w:footer="720" w:gutter="0"/>
+          <w:cols w:space="720"/>
+          <w:docGrid w:linePitch="360"/>
+        </w:sectPr>
+      </w:pPr>
+    </w:p>
+    <w:p>
+      <w:pPr>
+        <w:spacing w:before="0" w:after="0"/>
       </w:pPr>
       <w:r>
         <w:drawing>
@@ -259,11 +312,60 @@
               <a:graphicData uri="http://schemas.openxmlformats.org/drawingml/2006/picture">
                 <pic:pic>
                   <pic:nvPicPr>
-                    <pic:cNvPr id="0" name="page-7.png"/>
+                    <pic:cNvPr id="0" name="page_07.png"/>
                     <pic:cNvPicPr/>
                   </pic:nvPicPr>
                   <pic:blipFill>
                     <a:blip r:embed="rId15"/>
+                    <a:stretch>
+                      <a:fillRect/>
+                    </a:stretch>
+                  </pic:blipFill>
+                  <pic:spPr>
+                    <a:xfrm>
+                      <a:off x="0" y="0"/>
+                      <a:ext cx="6949440" cy="8993393"/>
+                    </a:xfrm>
+                    <a:prstGeom prst="rect"/>
+                  </pic:spPr>
+                </pic:pic>
+              </a:graphicData>
+            </a:graphic>
+          </wp:inline>
+        </w:drawing>
+      </w:r>
+    </w:p>
+    <w:p>
+      <w:pPr>
+        <w:sectPr>
+          <w:pgSz w:w="12240" w:h="15840"/>
+          <w:pgMar w:top="504" w:right="504" w:bottom="504" w:left="504" w:header="720" w:footer="720" w:gutter="0"/>
+          <w:cols w:space="720"/>
+          <w:docGrid w:linePitch="360"/>
+        </w:sectPr>
+      </w:pPr>
+    </w:p>
+    <w:p>
+      <w:pPr>
+        <w:spacing w:before="0" w:after="0"/>
+      </w:pPr>
+      <w:r>
+        <w:drawing>
+          <wp:inline xmlns:a="http://schemas.openxmlformats.org/drawingml/2006/main" xmlns:pic="http://schemas.openxmlformats.org/drawingml/2006/picture">
+            <wp:extent cx="6949440" cy="8993393"/>
+            <wp:docPr id="8" name="Picture 8"/>
+            <wp:cNvGraphicFramePr>
+              <a:graphicFrameLocks noChangeAspect="1"/>
+            </wp:cNvGraphicFramePr>
+            <a:graphic>
+              <a:graphicData uri="http://schemas.openxmlformats.org/drawingml/2006/picture">
+                <pic:pic>
+                  <pic:nvPicPr>
+                    <pic:cNvPr id="0" name="page_08.png"/>
+                    <pic:cNvPicPr/>
+                  </pic:nvPicPr>
+                  <pic:blipFill>
+                    <a:blip r:embed="rId16"/>
                     <a:stretch>
                       <a:fillRect/>
                     </a:stretch>

</xml_diff>